<commit_message>
added acknowledgements to research report
</commit_message>
<xml_diff>
--- a/Game Design Doc.docx
+++ b/Game Design Doc.docx
@@ -1,6 +1,6 @@
 
 <file path=word/document.xml><?xml version="1.0" encoding="utf-8"?>
-<w:document xmlns:wpc="http://schemas.microsoft.com/office/word/2010/wordprocessingCanvas" xmlns:cx="http://schemas.microsoft.com/office/drawing/2014/chartex" xmlns:cx1="http://schemas.microsoft.com/office/drawing/2015/9/8/chartex" xmlns:cx2="http://schemas.microsoft.com/office/drawing/2015/10/21/chartex" xmlns:cx3="http://schemas.microsoft.com/office/drawing/2016/5/9/chartex" xmlns:cx4="http://schemas.microsoft.com/office/drawing/2016/5/10/chartex" xmlns:cx5="http://schemas.microsoft.com/office/drawing/2016/5/11/chartex" xmlns:cx6="http://schemas.microsoft.com/office/drawing/2016/5/12/chartex" xmlns:cx7="http://schemas.microsoft.com/office/drawing/2016/5/13/chartex" xmlns:cx8="http://schemas.microsoft.com/office/drawing/2016/5/14/chartex" xmlns:mc="http://schemas.openxmlformats.org/markup-compatibility/2006" xmlns:aink="http://schemas.microsoft.com/office/drawing/2016/ink" xmlns:am3d="http://schemas.microsoft.com/office/drawing/2017/model3d" xmlns:o="urn:schemas-microsoft-com:office:office" xmlns:oel="http://schemas.microsoft.com/office/2019/extlst" xmlns:r="http://schemas.openxmlformats.org/officeDocument/2006/relationships" xmlns:m="http://schemas.openxmlformats.org/officeDocument/2006/math" xmlns:v="urn:schemas-microsoft-com:vml" xmlns:wp14="http://schemas.microsoft.com/office/word/2010/wordprocessingDrawing" xmlns:wp="http://schemas.openxmlformats.org/drawingml/2006/wordprocessingDrawing" xmlns:w10="urn:schemas-microsoft-com:office:word" xmlns:w="http://schemas.openxmlformats.org/wordprocessingml/2006/main" xmlns:w14="http://schemas.microsoft.com/office/word/2010/wordml" xmlns:w15="http://schemas.microsoft.com/office/word/2012/wordml" xmlns:w16cex="http://schemas.microsoft.com/office/word/2018/wordml/cex" xmlns:w16cid="http://schemas.microsoft.com/office/word/2016/wordml/cid" xmlns:w16="http://schemas.microsoft.com/office/word/2018/wordml" xmlns:w16du="http://schemas.microsoft.com/office/word/2023/wordml/word16du" xmlns:w16sdtdh="http://schemas.microsoft.com/office/word/2020/wordml/sdtdatahash" xmlns:w16sdtfl="http://schemas.microsoft.com/office/word/2024/wordml/sdtformatlock" xmlns:w16se="http://schemas.microsoft.com/office/word/2015/wordml/symex" xmlns:wpg="http://schemas.microsoft.com/office/word/2010/wordprocessingGroup" xmlns:wpi="http://schemas.microsoft.com/office/word/2010/wordprocessingInk" xmlns:wne="http://schemas.microsoft.com/office/word/2006/wordml" xmlns:wps="http://schemas.microsoft.com/office/word/2010/wordprocessingShape" mc:Ignorable="w14 w15 w16se w16cid w16 w16cex w16sdtdh w16sdtfl w16du wp14">
+<w:document xmlns:wpc="http://schemas.microsoft.com/office/word/2010/wordprocessingCanvas" xmlns:cx="http://schemas.microsoft.com/office/drawing/2014/chartex" xmlns:cx1="http://schemas.microsoft.com/office/drawing/2015/9/8/chartex" xmlns:cx2="http://schemas.microsoft.com/office/drawing/2015/10/21/chartex" xmlns:cx3="http://schemas.microsoft.com/office/drawing/2016/5/9/chartex" xmlns:cx4="http://schemas.microsoft.com/office/drawing/2016/5/10/chartex" xmlns:cx5="http://schemas.microsoft.com/office/drawing/2016/5/11/chartex" xmlns:cx6="http://schemas.microsoft.com/office/drawing/2016/5/12/chartex" xmlns:cx7="http://schemas.microsoft.com/office/drawing/2016/5/13/chartex" xmlns:cx8="http://schemas.microsoft.com/office/drawing/2016/5/14/chartex" xmlns:mc="http://schemas.openxmlformats.org/markup-compatibility/2006" xmlns:aink="http://schemas.microsoft.com/office/drawing/2016/ink" xmlns:am3d="http://schemas.microsoft.com/office/drawing/2017/model3d" xmlns:o="urn:schemas-microsoft-com:office:office" xmlns:r="http://schemas.openxmlformats.org/officeDocument/2006/relationships" xmlns:m="http://schemas.openxmlformats.org/officeDocument/2006/math" xmlns:v="urn:schemas-microsoft-com:vml" xmlns:wp14="http://schemas.microsoft.com/office/word/2010/wordprocessingDrawing" xmlns:wp="http://schemas.openxmlformats.org/drawingml/2006/wordprocessingDrawing" xmlns:w10="urn:schemas-microsoft-com:office:word" xmlns:w="http://schemas.openxmlformats.org/wordprocessingml/2006/main" xmlns:w14="http://schemas.microsoft.com/office/word/2010/wordml" xmlns:w15="http://schemas.microsoft.com/office/word/2012/wordml" xmlns:w16cex="http://schemas.microsoft.com/office/word/2018/wordml/cex" xmlns:w16cid="http://schemas.microsoft.com/office/word/2016/wordml/cid" xmlns:w16="http://schemas.microsoft.com/office/word/2018/wordml" xmlns:w16sdtdh="http://schemas.microsoft.com/office/word/2020/wordml/sdtdatahash" xmlns:w16se="http://schemas.microsoft.com/office/word/2015/wordml/symex" xmlns:wpg="http://schemas.microsoft.com/office/word/2010/wordprocessingGroup" xmlns:wpi="http://schemas.microsoft.com/office/word/2010/wordprocessingInk" xmlns:wne="http://schemas.microsoft.com/office/word/2006/wordml" xmlns:wps="http://schemas.microsoft.com/office/word/2010/wordprocessingShape" mc:Ignorable="w14 w15 w16se w16cid w16 w16cex w16sdtdh wp14">
   <w:body>
     <w:p>
       <w:pPr>
@@ -1945,159 +1945,6 @@
     </w:p>
     <w:p>
       <w:pPr>
-        <w:rPr>
-          <w:rFonts w:ascii="Times New Roman" w:hAnsi="Times New Roman" w:cs="Times New Roman"/>
-          <w:sz w:val="32"/>
-          <w:szCs w:val="32"/>
-        </w:rPr>
-      </w:pPr>
-    </w:p>
-    <w:p>
-      <w:pPr>
-        <w:rPr>
-          <w:rFonts w:ascii="Times New Roman" w:hAnsi="Times New Roman" w:cs="Times New Roman"/>
-          <w:sz w:val="32"/>
-          <w:szCs w:val="32"/>
-        </w:rPr>
-      </w:pPr>
-    </w:p>
-    <w:p>
-      <w:pPr>
-        <w:rPr>
-          <w:rFonts w:ascii="Times New Roman" w:hAnsi="Times New Roman" w:cs="Times New Roman"/>
-          <w:sz w:val="32"/>
-          <w:szCs w:val="32"/>
-        </w:rPr>
-      </w:pPr>
-    </w:p>
-    <w:p>
-      <w:pPr>
-        <w:rPr>
-          <w:rFonts w:ascii="Times New Roman" w:hAnsi="Times New Roman" w:cs="Times New Roman"/>
-          <w:sz w:val="32"/>
-          <w:szCs w:val="32"/>
-        </w:rPr>
-      </w:pPr>
-    </w:p>
-    <w:p>
-      <w:pPr>
-        <w:rPr>
-          <w:rFonts w:ascii="Times New Roman" w:hAnsi="Times New Roman" w:cs="Times New Roman"/>
-          <w:sz w:val="32"/>
-          <w:szCs w:val="32"/>
-        </w:rPr>
-      </w:pPr>
-    </w:p>
-    <w:p>
-      <w:pPr>
-        <w:rPr>
-          <w:rFonts w:ascii="Times New Roman" w:hAnsi="Times New Roman" w:cs="Times New Roman"/>
-          <w:sz w:val="32"/>
-          <w:szCs w:val="32"/>
-        </w:rPr>
-      </w:pPr>
-    </w:p>
-    <w:p>
-      <w:pPr>
-        <w:rPr>
-          <w:rFonts w:ascii="Times New Roman" w:hAnsi="Times New Roman" w:cs="Times New Roman"/>
-          <w:sz w:val="32"/>
-          <w:szCs w:val="32"/>
-        </w:rPr>
-      </w:pPr>
-    </w:p>
-    <w:p>
-      <w:pPr>
-        <w:rPr>
-          <w:rFonts w:ascii="Times New Roman" w:hAnsi="Times New Roman" w:cs="Times New Roman"/>
-          <w:sz w:val="32"/>
-          <w:szCs w:val="32"/>
-        </w:rPr>
-      </w:pPr>
-    </w:p>
-    <w:p>
-      <w:pPr>
-        <w:rPr>
-          <w:rFonts w:ascii="Times New Roman" w:hAnsi="Times New Roman" w:cs="Times New Roman"/>
-          <w:sz w:val="32"/>
-          <w:szCs w:val="32"/>
-        </w:rPr>
-      </w:pPr>
-    </w:p>
-    <w:p>
-      <w:pPr>
-        <w:rPr>
-          <w:rFonts w:ascii="Times New Roman" w:hAnsi="Times New Roman" w:cs="Times New Roman"/>
-          <w:sz w:val="32"/>
-          <w:szCs w:val="32"/>
-        </w:rPr>
-      </w:pPr>
-    </w:p>
-    <w:p>
-      <w:pPr>
-        <w:rPr>
-          <w:rFonts w:ascii="Times New Roman" w:hAnsi="Times New Roman" w:cs="Times New Roman"/>
-          <w:sz w:val="32"/>
-          <w:szCs w:val="32"/>
-        </w:rPr>
-      </w:pPr>
-    </w:p>
-    <w:p>
-      <w:pPr>
-        <w:rPr>
-          <w:rFonts w:ascii="Times New Roman" w:hAnsi="Times New Roman" w:cs="Times New Roman"/>
-          <w:sz w:val="32"/>
-          <w:szCs w:val="32"/>
-        </w:rPr>
-      </w:pPr>
-    </w:p>
-    <w:p>
-      <w:pPr>
-        <w:rPr>
-          <w:rFonts w:ascii="Times New Roman" w:hAnsi="Times New Roman" w:cs="Times New Roman"/>
-          <w:sz w:val="32"/>
-          <w:szCs w:val="32"/>
-        </w:rPr>
-      </w:pPr>
-    </w:p>
-    <w:p>
-      <w:pPr>
-        <w:rPr>
-          <w:rFonts w:ascii="Times New Roman" w:hAnsi="Times New Roman" w:cs="Times New Roman"/>
-          <w:sz w:val="32"/>
-          <w:szCs w:val="32"/>
-        </w:rPr>
-      </w:pPr>
-    </w:p>
-    <w:p>
-      <w:pPr>
-        <w:rPr>
-          <w:rFonts w:ascii="Times New Roman" w:hAnsi="Times New Roman" w:cs="Times New Roman"/>
-          <w:sz w:val="32"/>
-          <w:szCs w:val="32"/>
-        </w:rPr>
-      </w:pPr>
-    </w:p>
-    <w:p>
-      <w:pPr>
-        <w:rPr>
-          <w:rFonts w:ascii="Times New Roman" w:hAnsi="Times New Roman" w:cs="Times New Roman"/>
-          <w:sz w:val="32"/>
-          <w:szCs w:val="32"/>
-        </w:rPr>
-      </w:pPr>
-    </w:p>
-    <w:p>
-      <w:pPr>
-        <w:rPr>
-          <w:rFonts w:ascii="Times New Roman" w:hAnsi="Times New Roman" w:cs="Times New Roman"/>
-          <w:sz w:val="32"/>
-          <w:szCs w:val="32"/>
-        </w:rPr>
-      </w:pPr>
-    </w:p>
-    <w:p>
-      <w:pPr>
         <w:pStyle w:val="Heading1"/>
         <w:rPr>
           <w:rFonts w:ascii="Times New Roman" w:hAnsi="Times New Roman" w:cs="Times New Roman"/>
@@ -2110,6 +1957,7 @@
           <w:rFonts w:ascii="Times New Roman" w:hAnsi="Times New Roman" w:cs="Times New Roman"/>
           <w:color w:val="215E99" w:themeColor="text2" w:themeTint="BF"/>
         </w:rPr>
+        <w:lastRenderedPageBreak/>
         <w:t>Game Overview</w:t>
       </w:r>
       <w:bookmarkEnd w:id="0"/>
@@ -2262,7 +2110,6 @@
           <w:sz w:val="40"/>
           <w:szCs w:val="40"/>
         </w:rPr>
-        <w:lastRenderedPageBreak/>
         <w:t>General Features:</w:t>
       </w:r>
       <w:bookmarkEnd w:id="1"/>
@@ -2546,25 +2393,7 @@
           <w:sz w:val="24"/>
           <w:szCs w:val="24"/>
         </w:rPr>
-        <w:t xml:space="preserve">Movement is the </w:t>
-      </w:r>
-      <w:proofErr w:type="gramStart"/>
-      <w:r>
-        <w:rPr>
-          <w:rFonts w:ascii="Times New Roman" w:eastAsia="Arial" w:hAnsi="Times New Roman" w:cs="Times New Roman"/>
-          <w:sz w:val="24"/>
-          <w:szCs w:val="24"/>
-        </w:rPr>
-        <w:t>main focus</w:t>
-      </w:r>
-      <w:proofErr w:type="gramEnd"/>
-      <w:r>
-        <w:rPr>
-          <w:rFonts w:ascii="Times New Roman" w:eastAsia="Arial" w:hAnsi="Times New Roman" w:cs="Times New Roman"/>
-          <w:sz w:val="24"/>
-          <w:szCs w:val="24"/>
-        </w:rPr>
-        <w:t xml:space="preserve"> of the game. It uses a finite state machine with 20 states.12 core movement states and 8 short transition states that bridge between them. The system means movement feels natural rather than snapping between animations.</w:t>
+        <w:t>Movement is the main focus of the game. It uses a finite state machine with 20 states.12 core movement states and 8 short transition states that bridge between them. The system means movement feels natural rather than snapping between animations.</w:t>
       </w:r>
     </w:p>
     <w:p>
@@ -2596,6 +2425,7 @@
         <w:rPr>
           <w:rFonts w:ascii="Times New Roman" w:hAnsi="Times New Roman" w:cs="Times New Roman"/>
         </w:rPr>
+        <w:lastRenderedPageBreak/>
         <w:t>Controls</w:t>
       </w:r>
       <w:bookmarkEnd w:id="5"/>
@@ -3017,7 +2847,6 @@
           <w:rFonts w:ascii="Times New Roman" w:eastAsia="Arial" w:hAnsi="Times New Roman" w:cs="Times New Roman"/>
           <w:color w:val="215E99" w:themeColor="text2" w:themeTint="BF"/>
         </w:rPr>
-        <w:lastRenderedPageBreak/>
         <w:t>Core Movement States</w:t>
       </w:r>
       <w:bookmarkEnd w:id="6"/>
@@ -3718,6 +3547,7 @@
         <w:rPr>
           <w:rFonts w:ascii="Times New Roman" w:eastAsia="Arial" w:hAnsi="Times New Roman" w:cs="Times New Roman"/>
         </w:rPr>
+        <w:lastRenderedPageBreak/>
         <w:t xml:space="preserve">Sliding uses a separate velocity that decelerates </w:t>
       </w:r>
       <w:r>
@@ -3947,7 +3777,6 @@
         <w:rPr>
           <w:rFonts w:ascii="Times New Roman" w:eastAsia="Arial" w:hAnsi="Times New Roman" w:cs="Times New Roman"/>
         </w:rPr>
-        <w:lastRenderedPageBreak/>
         <w:t>Death - plays a death animation then sets the isDead flag</w:t>
       </w:r>
     </w:p>
@@ -4209,33 +4038,15 @@
           <w:sz w:val="24"/>
           <w:szCs w:val="24"/>
         </w:rPr>
-        <w:t xml:space="preserve"> </w:t>
-      </w:r>
-      <w:proofErr w:type="gramStart"/>
-      <w:r>
-        <w:rPr>
-          <w:rFonts w:ascii="Times New Roman" w:hAnsi="Times New Roman" w:cs="Times New Roman"/>
-          <w:sz w:val="24"/>
-          <w:szCs w:val="24"/>
-        </w:rPr>
-        <w:t>a distance of</w:t>
-      </w:r>
-      <w:r>
-        <w:rPr>
-          <w:rFonts w:ascii="Times New Roman" w:hAnsi="Times New Roman" w:cs="Times New Roman"/>
-          <w:sz w:val="24"/>
-          <w:szCs w:val="24"/>
-        </w:rPr>
-        <w:t xml:space="preserve"> 250</w:t>
-      </w:r>
-      <w:proofErr w:type="gramEnd"/>
-      <w:r>
-        <w:rPr>
-          <w:rFonts w:ascii="Times New Roman" w:hAnsi="Times New Roman" w:cs="Times New Roman"/>
-          <w:sz w:val="24"/>
-          <w:szCs w:val="24"/>
-        </w:rPr>
-        <w:t xml:space="preserve"> </w:t>
+        <w:t xml:space="preserve"> a distance of</w:t>
+      </w:r>
+      <w:r>
+        <w:rPr>
+          <w:rFonts w:ascii="Times New Roman" w:hAnsi="Times New Roman" w:cs="Times New Roman"/>
+          <w:sz w:val="24"/>
+          <w:szCs w:val="24"/>
+        </w:rPr>
+        <w:t xml:space="preserve"> 250 </w:t>
       </w:r>
       <w:r>
         <w:rPr>
@@ -4493,7 +4304,6 @@
         <w:rPr>
           <w:rFonts w:ascii="Times New Roman" w:hAnsi="Times New Roman" w:cs="Times New Roman"/>
         </w:rPr>
-        <w:lastRenderedPageBreak/>
         <w:t>Fuzzy Logic</w:t>
       </w:r>
       <w:bookmarkEnd w:id="15"/>
@@ -4560,7 +4370,6 @@
         </w:rPr>
         <w:t xml:space="preserve"> - returns 1.0 at </w:t>
       </w:r>
-      <w:proofErr w:type="gramStart"/>
       <w:r>
         <w:rPr>
           <w:rFonts w:ascii="Times New Roman" w:hAnsi="Times New Roman" w:cs="Times New Roman"/>
@@ -4575,16 +4384,7 @@
           <w:sz w:val="24"/>
           <w:szCs w:val="24"/>
         </w:rPr>
-        <w:t xml:space="preserve"> of 60</w:t>
-      </w:r>
-      <w:proofErr w:type="gramEnd"/>
-      <w:r>
-        <w:rPr>
-          <w:rFonts w:ascii="Times New Roman" w:hAnsi="Times New Roman" w:cs="Times New Roman"/>
-          <w:sz w:val="24"/>
-          <w:szCs w:val="24"/>
-        </w:rPr>
-        <w:t xml:space="preserve"> or less, fades to 0 at 80</w:t>
+        <w:t xml:space="preserve"> of 60 or less, fades to 0 at 80</w:t>
       </w:r>
     </w:p>
     <w:p>
@@ -4670,25 +4470,7 @@
           <w:sz w:val="24"/>
           <w:szCs w:val="24"/>
         </w:rPr>
-        <w:t xml:space="preserve">These feed into four rules for attack, block, dropkick and close gap. Each is scored from 0.0 t 1.0. The highest scoring rule that passes its set threshold is performed so long as it isn’t currently on cooldown. Attacking and Blocking have different cooldowns to prevent enemies spamming the same move </w:t>
-      </w:r>
-      <w:proofErr w:type="gramStart"/>
-      <w:r>
-        <w:rPr>
-          <w:rFonts w:ascii="Times New Roman" w:hAnsi="Times New Roman" w:cs="Times New Roman"/>
-          <w:sz w:val="24"/>
-          <w:szCs w:val="24"/>
-        </w:rPr>
-        <w:t>over and over</w:t>
-      </w:r>
-      <w:proofErr w:type="gramEnd"/>
-      <w:r>
-        <w:rPr>
-          <w:rFonts w:ascii="Times New Roman" w:hAnsi="Times New Roman" w:cs="Times New Roman"/>
-          <w:sz w:val="24"/>
-          <w:szCs w:val="24"/>
-        </w:rPr>
-        <w:t xml:space="preserve">. </w:t>
+        <w:t xml:space="preserve">These feed into four rules for attack, block, dropkick and close gap. Each is scored from 0.0 t 1.0. The highest scoring rule that passes its set threshold is performed so long as it isn’t currently on cooldown. Attacking and Blocking have different cooldowns to prevent enemies spamming the same move over and over. </w:t>
       </w:r>
     </w:p>
     <w:p>
@@ -4969,6 +4751,7 @@
           <w:sz w:val="24"/>
           <w:szCs w:val="24"/>
         </w:rPr>
+        <w:lastRenderedPageBreak/>
         <w:t xml:space="preserve">2 </w:t>
       </w:r>
       <w:r>
@@ -5116,25 +4899,7 @@
           <w:sz w:val="24"/>
           <w:szCs w:val="24"/>
         </w:rPr>
-        <w:t xml:space="preserve">Background elements are just there for visual </w:t>
-      </w:r>
-      <w:proofErr w:type="gramStart"/>
-      <w:r>
-        <w:rPr>
-          <w:rFonts w:ascii="Times New Roman" w:hAnsi="Times New Roman" w:cs="Times New Roman"/>
-          <w:sz w:val="24"/>
-          <w:szCs w:val="24"/>
-        </w:rPr>
-        <w:t>flare,</w:t>
-      </w:r>
-      <w:proofErr w:type="gramEnd"/>
-      <w:r>
-        <w:rPr>
-          <w:rFonts w:ascii="Times New Roman" w:hAnsi="Times New Roman" w:cs="Times New Roman"/>
-          <w:sz w:val="24"/>
-          <w:szCs w:val="24"/>
-        </w:rPr>
-        <w:t xml:space="preserve"> they can not be collided with or interacted with in any way.</w:t>
+        <w:t>Background elements are just there for visual flare, they can not be collided with or interacted with in any way.</w:t>
       </w:r>
     </w:p>
     <w:p>
@@ -5206,7 +4971,6 @@
           <w:rFonts w:ascii="Times New Roman" w:hAnsi="Times New Roman" w:cs="Times New Roman"/>
           <w:color w:val="215E99" w:themeColor="text2" w:themeTint="BF"/>
         </w:rPr>
-        <w:lastRenderedPageBreak/>
         <w:t>Level Design</w:t>
       </w:r>
       <w:bookmarkEnd w:id="18"/>
@@ -5789,6 +5553,7 @@
           <w:sz w:val="24"/>
           <w:szCs w:val="24"/>
         </w:rPr>
+        <w:lastRenderedPageBreak/>
         <w:t>foreground level colliders</w:t>
       </w:r>
     </w:p>
@@ -5942,7 +5707,7 @@
 </file>
 
 <file path=word/numbering.xml><?xml version="1.0" encoding="utf-8"?>
-<w:numbering xmlns:wpc="http://schemas.microsoft.com/office/word/2010/wordprocessingCanvas" xmlns:cx="http://schemas.microsoft.com/office/drawing/2014/chartex" xmlns:cx1="http://schemas.microsoft.com/office/drawing/2015/9/8/chartex" xmlns:cx2="http://schemas.microsoft.com/office/drawing/2015/10/21/chartex" xmlns:cx3="http://schemas.microsoft.com/office/drawing/2016/5/9/chartex" xmlns:cx4="http://schemas.microsoft.com/office/drawing/2016/5/10/chartex" xmlns:cx5="http://schemas.microsoft.com/office/drawing/2016/5/11/chartex" xmlns:cx6="http://schemas.microsoft.com/office/drawing/2016/5/12/chartex" xmlns:cx7="http://schemas.microsoft.com/office/drawing/2016/5/13/chartex" xmlns:cx8="http://schemas.microsoft.com/office/drawing/2016/5/14/chartex" xmlns:mc="http://schemas.openxmlformats.org/markup-compatibility/2006" xmlns:aink="http://schemas.microsoft.com/office/drawing/2016/ink" xmlns:am3d="http://schemas.microsoft.com/office/drawing/2017/model3d" xmlns:o="urn:schemas-microsoft-com:office:office" xmlns:oel="http://schemas.microsoft.com/office/2019/extlst" xmlns:r="http://schemas.openxmlformats.org/officeDocument/2006/relationships" xmlns:m="http://schemas.openxmlformats.org/officeDocument/2006/math" xmlns:v="urn:schemas-microsoft-com:vml" xmlns:wp14="http://schemas.microsoft.com/office/word/2010/wordprocessingDrawing" xmlns:wp="http://schemas.openxmlformats.org/drawingml/2006/wordprocessingDrawing" xmlns:w10="urn:schemas-microsoft-com:office:word" xmlns:w="http://schemas.openxmlformats.org/wordprocessingml/2006/main" xmlns:w14="http://schemas.microsoft.com/office/word/2010/wordml" xmlns:w15="http://schemas.microsoft.com/office/word/2012/wordml" xmlns:w16cex="http://schemas.microsoft.com/office/word/2018/wordml/cex" xmlns:w16cid="http://schemas.microsoft.com/office/word/2016/wordml/cid" xmlns:w16="http://schemas.microsoft.com/office/word/2018/wordml" xmlns:w16du="http://schemas.microsoft.com/office/word/2023/wordml/word16du" xmlns:w16sdtdh="http://schemas.microsoft.com/office/word/2020/wordml/sdtdatahash" xmlns:w16sdtfl="http://schemas.microsoft.com/office/word/2024/wordml/sdtformatlock" xmlns:w16se="http://schemas.microsoft.com/office/word/2015/wordml/symex" xmlns:wpg="http://schemas.microsoft.com/office/word/2010/wordprocessingGroup" xmlns:wpi="http://schemas.microsoft.com/office/word/2010/wordprocessingInk" xmlns:wne="http://schemas.microsoft.com/office/word/2006/wordml" xmlns:wps="http://schemas.microsoft.com/office/word/2010/wordprocessingShape" mc:Ignorable="w14 w15 w16se w16cid w16 w16cex w16sdtdh w16sdtfl w16du wp14">
+<w:numbering xmlns:wpc="http://schemas.microsoft.com/office/word/2010/wordprocessingCanvas" xmlns:cx="http://schemas.microsoft.com/office/drawing/2014/chartex" xmlns:cx1="http://schemas.microsoft.com/office/drawing/2015/9/8/chartex" xmlns:cx2="http://schemas.microsoft.com/office/drawing/2015/10/21/chartex" xmlns:cx3="http://schemas.microsoft.com/office/drawing/2016/5/9/chartex" xmlns:cx4="http://schemas.microsoft.com/office/drawing/2016/5/10/chartex" xmlns:cx5="http://schemas.microsoft.com/office/drawing/2016/5/11/chartex" xmlns:cx6="http://schemas.microsoft.com/office/drawing/2016/5/12/chartex" xmlns:cx7="http://schemas.microsoft.com/office/drawing/2016/5/13/chartex" xmlns:cx8="http://schemas.microsoft.com/office/drawing/2016/5/14/chartex" xmlns:mc="http://schemas.openxmlformats.org/markup-compatibility/2006" xmlns:aink="http://schemas.microsoft.com/office/drawing/2016/ink" xmlns:am3d="http://schemas.microsoft.com/office/drawing/2017/model3d" xmlns:o="urn:schemas-microsoft-com:office:office" xmlns:r="http://schemas.openxmlformats.org/officeDocument/2006/relationships" xmlns:m="http://schemas.openxmlformats.org/officeDocument/2006/math" xmlns:v="urn:schemas-microsoft-com:vml" xmlns:wp14="http://schemas.microsoft.com/office/word/2010/wordprocessingDrawing" xmlns:wp="http://schemas.openxmlformats.org/drawingml/2006/wordprocessingDrawing" xmlns:w10="urn:schemas-microsoft-com:office:word" xmlns:w="http://schemas.openxmlformats.org/wordprocessingml/2006/main" xmlns:w14="http://schemas.microsoft.com/office/word/2010/wordml" xmlns:w15="http://schemas.microsoft.com/office/word/2012/wordml" xmlns:w16cex="http://schemas.microsoft.com/office/word/2018/wordml/cex" xmlns:w16cid="http://schemas.microsoft.com/office/word/2016/wordml/cid" xmlns:w16="http://schemas.microsoft.com/office/word/2018/wordml" xmlns:w16sdtdh="http://schemas.microsoft.com/office/word/2020/wordml/sdtdatahash" xmlns:w16se="http://schemas.microsoft.com/office/word/2015/wordml/symex" xmlns:wpg="http://schemas.microsoft.com/office/word/2010/wordprocessingGroup" xmlns:wpi="http://schemas.microsoft.com/office/word/2010/wordprocessingInk" xmlns:wne="http://schemas.microsoft.com/office/word/2006/wordml" xmlns:wps="http://schemas.microsoft.com/office/word/2010/wordprocessingShape" mc:Ignorable="w14 w15 w16se w16cid w16 w16cex w16sdtdh wp14">
   <w:abstractNum w:abstractNumId="0" w15:restartNumberingAfterBreak="0">
     <w:nsid w:val="08B23FFE"/>
     <w:multiLevelType w:val="hybridMultilevel"/>
@@ -7913,65 +7678,65 @@
       </w:rPr>
     </w:lvl>
   </w:abstractNum>
-  <w:num w:numId="1" w16cid:durableId="598024203">
+  <w:num w:numId="1">
     <w:abstractNumId w:val="15"/>
   </w:num>
-  <w:num w:numId="2" w16cid:durableId="691761561">
+  <w:num w:numId="2">
     <w:abstractNumId w:val="11"/>
   </w:num>
-  <w:num w:numId="3" w16cid:durableId="1178419996">
+  <w:num w:numId="3">
     <w:abstractNumId w:val="9"/>
   </w:num>
-  <w:num w:numId="4" w16cid:durableId="2006201281">
+  <w:num w:numId="4">
     <w:abstractNumId w:val="7"/>
   </w:num>
-  <w:num w:numId="5" w16cid:durableId="2104765700">
+  <w:num w:numId="5">
     <w:abstractNumId w:val="2"/>
   </w:num>
-  <w:num w:numId="6" w16cid:durableId="1104374715">
+  <w:num w:numId="6">
     <w:abstractNumId w:val="8"/>
   </w:num>
-  <w:num w:numId="7" w16cid:durableId="1710839767">
+  <w:num w:numId="7">
     <w:abstractNumId w:val="4"/>
   </w:num>
-  <w:num w:numId="8" w16cid:durableId="370107333">
+  <w:num w:numId="8">
     <w:abstractNumId w:val="6"/>
   </w:num>
-  <w:num w:numId="9" w16cid:durableId="1489906788">
+  <w:num w:numId="9">
     <w:abstractNumId w:val="13"/>
   </w:num>
-  <w:num w:numId="10" w16cid:durableId="1526089847">
+  <w:num w:numId="10">
     <w:abstractNumId w:val="5"/>
   </w:num>
-  <w:num w:numId="11" w16cid:durableId="1033313377">
+  <w:num w:numId="11">
     <w:abstractNumId w:val="16"/>
   </w:num>
-  <w:num w:numId="12" w16cid:durableId="420756602">
+  <w:num w:numId="12">
     <w:abstractNumId w:val="10"/>
   </w:num>
-  <w:num w:numId="13" w16cid:durableId="1903446094">
+  <w:num w:numId="13">
     <w:abstractNumId w:val="1"/>
   </w:num>
-  <w:num w:numId="14" w16cid:durableId="991522159">
+  <w:num w:numId="14">
     <w:abstractNumId w:val="0"/>
   </w:num>
-  <w:num w:numId="15" w16cid:durableId="1576821929">
+  <w:num w:numId="15">
     <w:abstractNumId w:val="12"/>
     <w:lvlOverride w:ilvl="0">
       <w:startOverride w:val="1"/>
     </w:lvlOverride>
   </w:num>
-  <w:num w:numId="16" w16cid:durableId="1021932033">
+  <w:num w:numId="16">
     <w:abstractNumId w:val="14"/>
   </w:num>
-  <w:num w:numId="17" w16cid:durableId="1723744701">
+  <w:num w:numId="17">
     <w:abstractNumId w:val="3"/>
   </w:num>
 </w:numbering>
 </file>
 
 <file path=word/styles.xml><?xml version="1.0" encoding="utf-8"?>
-<w:styles xmlns:mc="http://schemas.openxmlformats.org/markup-compatibility/2006" xmlns:r="http://schemas.openxmlformats.org/officeDocument/2006/relationships" xmlns:w="http://schemas.openxmlformats.org/wordprocessingml/2006/main" xmlns:w14="http://schemas.microsoft.com/office/word/2010/wordml" xmlns:w15="http://schemas.microsoft.com/office/word/2012/wordml" xmlns:w16cex="http://schemas.microsoft.com/office/word/2018/wordml/cex" xmlns:w16cid="http://schemas.microsoft.com/office/word/2016/wordml/cid" xmlns:w16="http://schemas.microsoft.com/office/word/2018/wordml" xmlns:w16du="http://schemas.microsoft.com/office/word/2023/wordml/word16du" xmlns:w16sdtdh="http://schemas.microsoft.com/office/word/2020/wordml/sdtdatahash" xmlns:w16sdtfl="http://schemas.microsoft.com/office/word/2024/wordml/sdtformatlock" xmlns:w16se="http://schemas.microsoft.com/office/word/2015/wordml/symex" mc:Ignorable="w14 w15 w16se w16cid w16 w16cex w16sdtdh w16sdtfl w16du">
+<w:styles xmlns:mc="http://schemas.openxmlformats.org/markup-compatibility/2006" xmlns:r="http://schemas.openxmlformats.org/officeDocument/2006/relationships" xmlns:w="http://schemas.openxmlformats.org/wordprocessingml/2006/main" xmlns:w14="http://schemas.microsoft.com/office/word/2010/wordml" xmlns:w15="http://schemas.microsoft.com/office/word/2012/wordml" xmlns:w16cex="http://schemas.microsoft.com/office/word/2018/wordml/cex" xmlns:w16cid="http://schemas.microsoft.com/office/word/2016/wordml/cid" xmlns:w16="http://schemas.microsoft.com/office/word/2018/wordml" xmlns:w16sdtdh="http://schemas.microsoft.com/office/word/2020/wordml/sdtdatahash" xmlns:w16se="http://schemas.microsoft.com/office/word/2015/wordml/symex" mc:Ignorable="w14 w15 w16se w16cid w16 w16cex w16sdtdh">
   <w:docDefaults>
     <w:rPrDefault>
       <w:rPr>

</xml_diff>